<commit_message>
1.2.0 step 0 done: D1 answered, test harness removed
Record the worker-window test in DATA_PIPELINE_DESIGN.md section 8 and the
D1 row. From an unfocused, never-activated window: visible 10/10, covered
10/10, screen locked 10/10 lookups, 0 timeouts, about 2 s each, focus never
taken. Chrome marks a covered or locked window hidden and slows its timers,
but pages still load and the content script still reports. So the
"only while the user is away" fallback, the pause on a locked screen and
the idle permission are all dropped.

Found in passing: 6 of 30 lookups read a different company id from the
stored one. Left to step 1's readiness work (re-check a stored id against
its own page before it counts as verified).

Remove the throwaway harness (code/window-test*) and its import in
background.js, which is now identical to before step 0.

Co-Authored-By: Claude Opus 5.5 <noreply@anthropic.com>
</commit_message>
<xml_diff>
--- a/DATA_PIPELINE_DESIGN.docx
+++ b/DATA_PIPELINE_DESIGN.docx
@@ -6370,6 +6370,587 @@
     </w:p>
     <w:p>
       <w:pPr>
+        <w:pStyle w:val="Heading3"/>
+      </w:pPr>
+      <w:r>
+        <w:rPr>
+          <w:b w:val="0"/>
+        </w:rPr>
+        <w:t>Step 0 result (tested 2026-09-24/25): option A works, no fallback needed</w:t>
+      </w:r>
+    </w:p>
+    <w:p>
+      <w:r>
+        <w:rPr>
+          <w:b w:val="0"/>
+        </w:rPr>
+        <w:t>A throwaway harness ran real company-page lookups (the direct-link path, the heaviest page and the</w:t>
+      </w:r>
+    </w:p>
+    <w:p>
+      <w:r>
+        <w:rPr>
+          <w:b w:val="0"/>
+        </w:rPr>
+        <w:t xml:space="preserve">one that caused the old timeouts) from a window created with </w:t>
+      </w:r>
+      <w:r>
+        <w:rPr>
+          <w:rFonts w:ascii="Consolas" w:hAnsi="Consolas"/>
+          <w:b w:val="0"/>
+        </w:rPr>
+        <w:t>focused: false</w:t>
+      </w:r>
+      <w:r>
+        <w:rPr>
+          <w:b w:val="0"/>
+        </w:rPr>
+        <w:t>, never made active,</w:t>
+      </w:r>
+    </w:p>
+    <w:p>
+      <w:r>
+        <w:rPr>
+          <w:b w:val="0"/>
+        </w:rPr>
+        <w:t>with no keep-awake. A zero-touch probe page in the same tab recorded how Chrome treated the window.</w:t>
+      </w:r>
+    </w:p>
+    <w:tbl>
+      <w:tblPr>
+        <w:tblStyle w:val="TableGrid"/>
+        <w:tblW w:type="auto" w:w="0"/>
+        <w:tblLook w:firstColumn="1" w:firstRow="1" w:lastColumn="0" w:lastRow="0" w:noHBand="0" w:noVBand="1" w:val="04A0"/>
+      </w:tblPr>
+      <w:tblGrid>
+        <w:gridCol w:w="1728"/>
+        <w:gridCol w:w="1728"/>
+        <w:gridCol w:w="1728"/>
+        <w:gridCol w:w="1728"/>
+        <w:gridCol w:w="1728"/>
+      </w:tblGrid>
+      <w:tr>
+        <w:tc>
+          <w:tcPr>
+            <w:tcW w:type="dxa" w:w="1728"/>
+          </w:tcPr>
+          <w:p>
+            <w:r/>
+            <w:r>
+              <w:rPr>
+                <w:b/>
+              </w:rPr>
+              <w:t>Condition</w:t>
+            </w:r>
+          </w:p>
+        </w:tc>
+        <w:tc>
+          <w:tcPr>
+            <w:tcW w:type="dxa" w:w="1728"/>
+          </w:tcPr>
+          <w:p>
+            <w:r/>
+            <w:r>
+              <w:rPr>
+                <w:b/>
+              </w:rPr>
+              <w:t>Chrome's view of the window</w:t>
+            </w:r>
+          </w:p>
+        </w:tc>
+        <w:tc>
+          <w:tcPr>
+            <w:tcW w:type="dxa" w:w="1728"/>
+          </w:tcPr>
+          <w:p>
+            <w:r/>
+            <w:r>
+              <w:rPr>
+                <w:b/>
+              </w:rPr>
+              <w:t>Lookups</w:t>
+            </w:r>
+          </w:p>
+        </w:tc>
+        <w:tc>
+          <w:tcPr>
+            <w:tcW w:type="dxa" w:w="1728"/>
+          </w:tcPr>
+          <w:p>
+            <w:r/>
+            <w:r>
+              <w:rPr>
+                <w:b/>
+              </w:rPr>
+              <w:t>Timeouts</w:t>
+            </w:r>
+          </w:p>
+        </w:tc>
+        <w:tc>
+          <w:tcPr>
+            <w:tcW w:type="dxa" w:w="1728"/>
+          </w:tcPr>
+          <w:p>
+            <w:r/>
+            <w:r>
+              <w:rPr>
+                <w:b/>
+              </w:rPr>
+              <w:t>Avg / max result</w:t>
+            </w:r>
+          </w:p>
+        </w:tc>
+      </w:tr>
+      <w:tr>
+        <w:tc>
+          <w:tcPr>
+            <w:tcW w:type="dxa" w:w="1728"/>
+          </w:tcPr>
+          <w:p>
+            <w:r/>
+            <w:r>
+              <w:rPr>
+                <w:b w:val="0"/>
+              </w:rPr>
+              <w:t>(a) visible</w:t>
+            </w:r>
+          </w:p>
+        </w:tc>
+        <w:tc>
+          <w:tcPr>
+            <w:tcW w:type="dxa" w:w="1728"/>
+          </w:tcPr>
+          <w:p>
+            <w:r/>
+            <w:r>
+              <w:rPr>
+                <w:b w:val="0"/>
+              </w:rPr>
+              <w:t>visible, 60 frames/s</w:t>
+            </w:r>
+          </w:p>
+        </w:tc>
+        <w:tc>
+          <w:tcPr>
+            <w:tcW w:type="dxa" w:w="1728"/>
+          </w:tcPr>
+          <w:p>
+            <w:r/>
+            <w:r>
+              <w:rPr>
+                <w:b w:val="0"/>
+              </w:rPr>
+              <w:t>10/10</w:t>
+            </w:r>
+          </w:p>
+        </w:tc>
+        <w:tc>
+          <w:tcPr>
+            <w:tcW w:type="dxa" w:w="1728"/>
+          </w:tcPr>
+          <w:p>
+            <w:r/>
+            <w:r>
+              <w:rPr>
+                <w:b w:val="0"/>
+              </w:rPr>
+              <w:t>0</w:t>
+            </w:r>
+          </w:p>
+        </w:tc>
+        <w:tc>
+          <w:tcPr>
+            <w:tcW w:type="dxa" w:w="1728"/>
+          </w:tcPr>
+          <w:p>
+            <w:r/>
+            <w:r>
+              <w:rPr>
+                <w:b w:val="0"/>
+              </w:rPr>
+              <w:t>2.3 s / 3.6 s</w:t>
+            </w:r>
+          </w:p>
+        </w:tc>
+      </w:tr>
+      <w:tr>
+        <w:tc>
+          <w:tcPr>
+            <w:tcW w:type="dxa" w:w="1728"/>
+          </w:tcPr>
+          <w:p>
+            <w:r/>
+            <w:r>
+              <w:rPr>
+                <w:b w:val="0"/>
+              </w:rPr>
+              <w:t>(b) covered</w:t>
+            </w:r>
+          </w:p>
+        </w:tc>
+        <w:tc>
+          <w:tcPr>
+            <w:tcW w:type="dxa" w:w="1728"/>
+          </w:tcPr>
+          <w:p>
+            <w:r/>
+            <w:r>
+              <w:rPr>
+                <w:b w:val="0"/>
+              </w:rPr>
+              <w:t>hidden, 0.1 frames/s, timers held to ~1 s</w:t>
+            </w:r>
+          </w:p>
+        </w:tc>
+        <w:tc>
+          <w:tcPr>
+            <w:tcW w:type="dxa" w:w="1728"/>
+          </w:tcPr>
+          <w:p>
+            <w:r/>
+            <w:r>
+              <w:rPr>
+                <w:b w:val="0"/>
+              </w:rPr>
+              <w:t>10/10</w:t>
+            </w:r>
+          </w:p>
+        </w:tc>
+        <w:tc>
+          <w:tcPr>
+            <w:tcW w:type="dxa" w:w="1728"/>
+          </w:tcPr>
+          <w:p>
+            <w:r/>
+            <w:r>
+              <w:rPr>
+                <w:b w:val="0"/>
+              </w:rPr>
+              <w:t>0</w:t>
+            </w:r>
+          </w:p>
+        </w:tc>
+        <w:tc>
+          <w:tcPr>
+            <w:tcW w:type="dxa" w:w="1728"/>
+          </w:tcPr>
+          <w:p>
+            <w:r/>
+            <w:r>
+              <w:rPr>
+                <w:b w:val="0"/>
+              </w:rPr>
+              <w:t>2.0 s / 2.6 s</w:t>
+            </w:r>
+          </w:p>
+        </w:tc>
+      </w:tr>
+      <w:tr>
+        <w:tc>
+          <w:tcPr>
+            <w:tcW w:type="dxa" w:w="1728"/>
+          </w:tcPr>
+          <w:p>
+            <w:r/>
+            <w:r>
+              <w:rPr>
+                <w:b w:val="0"/>
+              </w:rPr>
+              <w:t>(c) minimised</w:t>
+            </w:r>
+          </w:p>
+        </w:tc>
+        <w:tc>
+          <w:tcPr>
+            <w:tcW w:type="dxa" w:w="1728"/>
+          </w:tcPr>
+          <w:p>
+            <w:r/>
+            <w:r>
+              <w:rPr>
+                <w:b w:val="0"/>
+              </w:rPr>
+              <w:t>hidden, same as covered (probe only)</w:t>
+            </w:r>
+          </w:p>
+        </w:tc>
+        <w:tc>
+          <w:tcPr>
+            <w:tcW w:type="dxa" w:w="1728"/>
+          </w:tcPr>
+          <w:p>
+            <w:r/>
+            <w:r>
+              <w:rPr>
+                <w:b w:val="0"/>
+              </w:rPr>
+              <w:t>—</w:t>
+            </w:r>
+          </w:p>
+        </w:tc>
+        <w:tc>
+          <w:tcPr>
+            <w:tcW w:type="dxa" w:w="1728"/>
+          </w:tcPr>
+          <w:p>
+            <w:r/>
+            <w:r>
+              <w:rPr>
+                <w:b w:val="0"/>
+              </w:rPr>
+              <w:t>—</w:t>
+            </w:r>
+          </w:p>
+        </w:tc>
+        <w:tc>
+          <w:tcPr>
+            <w:tcW w:type="dxa" w:w="1728"/>
+          </w:tcPr>
+          <w:p>
+            <w:r/>
+            <w:r>
+              <w:rPr>
+                <w:b w:val="0"/>
+              </w:rPr>
+              <w:t>—</w:t>
+            </w:r>
+          </w:p>
+        </w:tc>
+      </w:tr>
+      <w:tr>
+        <w:tc>
+          <w:tcPr>
+            <w:tcW w:type="dxa" w:w="1728"/>
+          </w:tcPr>
+          <w:p>
+            <w:r/>
+            <w:r>
+              <w:rPr>
+                <w:b w:val="0"/>
+              </w:rPr>
+              <w:t>(d) screen locked, machine awake</w:t>
+            </w:r>
+          </w:p>
+        </w:tc>
+        <w:tc>
+          <w:tcPr>
+            <w:tcW w:type="dxa" w:w="1728"/>
+          </w:tcPr>
+          <w:p>
+            <w:r/>
+            <w:r>
+              <w:rPr>
+                <w:b w:val="0"/>
+              </w:rPr>
+              <w:t>hidden, same as covered</w:t>
+            </w:r>
+          </w:p>
+        </w:tc>
+        <w:tc>
+          <w:tcPr>
+            <w:tcW w:type="dxa" w:w="1728"/>
+          </w:tcPr>
+          <w:p>
+            <w:r/>
+            <w:r>
+              <w:rPr>
+                <w:b w:val="0"/>
+              </w:rPr>
+              <w:t>10/10</w:t>
+            </w:r>
+          </w:p>
+        </w:tc>
+        <w:tc>
+          <w:tcPr>
+            <w:tcW w:type="dxa" w:w="1728"/>
+          </w:tcPr>
+          <w:p>
+            <w:r/>
+            <w:r>
+              <w:rPr>
+                <w:b w:val="0"/>
+              </w:rPr>
+              <w:t>0</w:t>
+            </w:r>
+          </w:p>
+        </w:tc>
+        <w:tc>
+          <w:tcPr>
+            <w:tcW w:type="dxa" w:w="1728"/>
+          </w:tcPr>
+          <w:p>
+            <w:r/>
+            <w:r>
+              <w:rPr>
+                <w:b w:val="0"/>
+              </w:rPr>
+              <w:t>2.2 s / 3.1 s</w:t>
+            </w:r>
+          </w:p>
+        </w:tc>
+      </w:tr>
+    </w:tbl>
+    <w:p/>
+    <w:p>
+      <w:pPr>
+        <w:pStyle w:val="ListBullet"/>
+      </w:pPr>
+      <w:r>
+        <w:rPr>
+          <w:b/>
+        </w:rPr>
+        <w:t>Hidden does not mean broken.</w:t>
+      </w:r>
+      <w:r>
+        <w:rPr>
+          <w:b w:val="0"/>
+        </w:rPr>
+        <w:t xml:space="preserve"> Chrome stops drawing a covered, minimised or locked window and</w:t>
+      </w:r>
+    </w:p>
+    <w:p>
+      <w:r>
+        <w:rPr>
+          <w:b w:val="0"/>
+        </w:rPr>
+        <w:t xml:space="preserve">  slows its timers, but the page still loads and the content script still reads it and reports back</w:t>
+      </w:r>
+    </w:p>
+    <w:p>
+      <w:r>
+        <w:rPr>
+          <w:b w:val="0"/>
+        </w:rPr>
+        <w:t xml:space="preserve">  as fast as when visible. The old background-tab timeouts are not reproduced by a hidden window.</w:t>
+      </w:r>
+    </w:p>
+    <w:p>
+      <w:pPr>
+        <w:pStyle w:val="ListBullet"/>
+      </w:pPr>
+      <w:r>
+        <w:rPr>
+          <w:b/>
+        </w:rPr>
+        <w:t>The window never took focus</w:t>
+      </w:r>
+      <w:r>
+        <w:rPr>
+          <w:b w:val="0"/>
+        </w:rPr>
+        <w:t xml:space="preserve"> in any round, and does not need to be activated once to work.</w:t>
+      </w:r>
+    </w:p>
+    <w:p>
+      <w:pPr>
+        <w:pStyle w:val="ListBullet"/>
+      </w:pPr>
+      <w:r>
+        <w:rPr>
+          <w:b/>
+        </w:rPr>
+        <w:t>Consequences for the design:</w:t>
+      </w:r>
+      <w:r>
+        <w:rPr>
+          <w:b w:val="0"/>
+        </w:rPr>
+        <w:t xml:space="preserve"> the fallback (B, run only while the user is away) is not needed,</w:t>
+      </w:r>
+    </w:p>
+    <w:p>
+      <w:r>
+        <w:rPr>
+          <w:b w:val="0"/>
+        </w:rPr>
+        <w:t xml:space="preserve">  and neither is the pause on </w:t>
+      </w:r>
+      <w:r>
+        <w:rPr>
+          <w:rFonts w:ascii="Consolas" w:hAnsi="Consolas"/>
+          <w:b w:val="0"/>
+        </w:rPr>
+        <w:t>chrome.idle</w:t>
+      </w:r>
+      <w:r>
+        <w:rPr>
+          <w:b w:val="0"/>
+        </w:rPr>
+        <w:t xml:space="preserve"> "locked" described above. The </w:t>
+      </w:r>
+      <w:r>
+        <w:rPr>
+          <w:rFonts w:ascii="Consolas" w:hAnsi="Consolas"/>
+          <w:b w:val="0"/>
+        </w:rPr>
+        <w:t>idle</w:t>
+      </w:r>
+      <w:r>
+        <w:rPr>
+          <w:b w:val="0"/>
+        </w:rPr>
+        <w:t xml:space="preserve"> permission is not</w:t>
+      </w:r>
+    </w:p>
+    <w:p>
+      <w:r>
+        <w:rPr>
+          <w:b w:val="0"/>
+        </w:rPr>
+        <w:t xml:space="preserve">  required. The window will usually open behind the user's work, which is expected and harmless.</w:t>
+      </w:r>
+    </w:p>
+    <w:p>
+      <w:pPr>
+        <w:pStyle w:val="ListBullet"/>
+      </w:pPr>
+      <w:r>
+        <w:rPr>
+          <w:b/>
+        </w:rPr>
+        <w:t>Found in passing, not a window issue:</w:t>
+      </w:r>
+      <w:r>
+        <w:rPr>
+          <w:b w:val="0"/>
+        </w:rPr>
+        <w:t xml:space="preserve"> 6 of the 30 lookups read a different company id from the</w:t>
+      </w:r>
+    </w:p>
+    <w:p>
+      <w:r>
+        <w:rPr>
+          <w:b w:val="0"/>
+        </w:rPr>
+        <w:t xml:space="preserve">  one stored for that account (Octapharma, Comet Holding, Lalique Group, Komax Holding, FMV, BNP</w:t>
+      </w:r>
+    </w:p>
+    <w:p>
+      <w:r>
+        <w:rPr>
+          <w:b w:val="0"/>
+        </w:rPr>
+        <w:t xml:space="preserve">  Paribas Switzerland). Since the Scanner selects accounts by that id, this is a readiness question</w:t>
+      </w:r>
+    </w:p>
+    <w:p>
+      <w:r>
+        <w:rPr>
+          <w:b w:val="0"/>
+        </w:rPr>
+        <w:t xml:space="preserve">  for step 1: a stored id should be re-checked against its own LinkedIn page before it counts as</w:t>
+      </w:r>
+    </w:p>
+    <w:p>
+      <w:r>
+        <w:rPr>
+          <w:b w:val="0"/>
+        </w:rPr>
+        <w:t xml:space="preserve">  verified. Which side is wrong has not been established yet.</w:t>
+      </w:r>
+    </w:p>
+    <w:p>
+      <w:pPr>
         <w:pStyle w:val="Heading2"/>
       </w:pPr>
       <w:r>
@@ -8684,7 +9265,19 @@
               <w:rPr>
                 <w:b w:val="0"/>
               </w:rPr>
-              <w:t>A dedicated unfocused SalesTeam window, proven by the step 0 test; "only while the user is away" as the fallback (section 8)</w:t>
+              <w:t xml:space="preserve">A dedicated unfocused SalesTeam window, proven by the step 0 test; "only while the user is away" as the fallback (section 8). </w:t>
+            </w:r>
+            <w:r>
+              <w:rPr>
+                <w:b/>
+              </w:rPr>
+              <w:t>Step 0 passed on 2026-09-25</w:t>
+            </w:r>
+            <w:r>
+              <w:rPr>
+                <w:b w:val="0"/>
+              </w:rPr>
+              <w:t>: 30/30 lookups, 0 timeouts, visible, covered and locked; no fallback needed</w:t>
             </w:r>
           </w:p>
         </w:tc>

</xml_diff>

<commit_message>
1.1.4 / 1.2.0 step 1: readiness, read-only
- readiness.js (pure, tested): one definition of Ready / Usable / In progress, required fields
  follow the Setup targeting, freshness windows, the stored-id re-check rule
- getAccountViews(): the one join of the three account stores; getScanTargetCompanyIds rebuilt
  on isScannable (deleted/excluded never scanned; Discovered companies now scanned)
- provenance per field in extras, stamped by every writer, derived once for existing data
- defects: "6,500+" no longer counts as missing size; derived priorities re-scored as data arrives
- Target Accounts: Pipeline status pie with a per-field "Still to do" line, Readiness column
- contacts: workbook Seniority column used first; any "Chief ... Officer" title is C-level;
  "LinkedIn Profile" column renamed "Contact Link", labelled by site
- version 1.1.4; design doc records step 1 as built and the live-test findings

Co-Authored-By: Claude Opus 5.5 <noreply@anthropic.com>
</commit_message>
<xml_diff>
--- a/DATA_PIPELINE_DESIGN.docx
+++ b/DATA_PIPELINE_DESIGN.docx
@@ -44,7 +44,7 @@
         <w:rPr>
           <w:b w:val="0"/>
         </w:rPr>
-        <w:t xml:space="preserve"> (section 12). Implementation starts with build step 0.</w:t>
+        <w:t xml:space="preserve"> (section 12). Step 0 done 2026-09-25; step 1 built 2026-09-25, awaiting a live check (section 11, *Step 1 as built*).</w:t>
       </w:r>
     </w:p>
     <w:p>
@@ -2801,49 +2801,49 @@
         <w:rPr>
           <w:b w:val="0"/>
         </w:rPr>
-        <w:t xml:space="preserve">which counts as LinkedIn. Contacts keep their existing </w:t>
+        <w:t>which counts as LinkedIn. Contacts need no new schema: a contact counts as verified when it has a</w:t>
+      </w:r>
+    </w:p>
+    <w:p>
+      <w:r>
+        <w:rPr>
+          <w:b w:val="0"/>
+        </w:rPr>
+        <w:t>LinkedIn profile URL (</w:t>
       </w:r>
       <w:r>
         <w:rPr>
           <w:rFonts w:ascii="Consolas" w:hAnsi="Consolas"/>
           <w:b w:val="0"/>
         </w:rPr>
+        <w:t>lastVerified2</w:t>
+      </w:r>
+      <w:r>
+        <w:rPr>
+          <w:b w:val="0"/>
+        </w:rPr>
+        <w:t xml:space="preserve">, which holds the URL, not a date) and its </w:t>
+      </w:r>
+      <w:r>
+        <w:rPr>
+          <w:rFonts w:ascii="Consolas" w:hAnsi="Consolas"/>
+          <w:b w:val="0"/>
+        </w:rPr>
         <w:t>lastVerified</w:t>
       </w:r>
       <w:r>
         <w:rPr>
           <w:b w:val="0"/>
         </w:rPr>
-        <w:t xml:space="preserve"> / </w:t>
-      </w:r>
-      <w:r>
-        <w:rPr>
-          <w:rFonts w:ascii="Consolas" w:hAnsi="Consolas"/>
-          <w:b w:val="0"/>
-        </w:rPr>
-        <w:t>lastVerified2</w:t>
-      </w:r>
-      <w:r>
-        <w:rPr>
-          <w:b w:val="0"/>
-        </w:rPr>
-        <w:t xml:space="preserve"> pair, so no</w:t>
-      </w:r>
-    </w:p>
-    <w:p>
-      <w:r>
-        <w:rPr>
-          <w:b w:val="0"/>
-        </w:rPr>
-        <w:t>new contact schema is needed. A contact counts as verified when it has a LinkedIn profile URL and</w:t>
-      </w:r>
-    </w:p>
-    <w:p>
-      <w:r>
-        <w:rPr>
-          <w:b w:val="0"/>
-        </w:rPr>
-        <w:t>either date is within 6 months.</w:t>
+        <w:t xml:space="preserve"> date</w:t>
+      </w:r>
+    </w:p>
+    <w:p>
+      <w:r>
+        <w:rPr>
+          <w:b w:val="0"/>
+        </w:rPr>
+        <w:t>is within 6 months (corrected in step 1, see section 11).</w:t>
       </w:r>
     </w:p>
     <w:p>
@@ -9150,6 +9150,928 @@
           <w:b w:val="0"/>
         </w:rPr>
         <w:t>internal builds, and that 1.2.0 is whichever build he decides to submit.</w:t>
+      </w:r>
+    </w:p>
+    <w:p>
+      <w:pPr>
+        <w:pStyle w:val="Heading3"/>
+      </w:pPr>
+      <w:r>
+        <w:rPr>
+          <w:b w:val="0"/>
+        </w:rPr>
+        <w:t>Step 1 as built (2026-09-25)</w:t>
+      </w:r>
+    </w:p>
+    <w:p>
+      <w:r>
+        <w:rPr>
+          <w:b w:val="0"/>
+        </w:rPr>
+        <w:t xml:space="preserve">Branch </w:t>
+      </w:r>
+      <w:r>
+        <w:rPr>
+          <w:rFonts w:ascii="Consolas" w:hAnsi="Consolas"/>
+          <w:b w:val="0"/>
+        </w:rPr>
+        <w:t>feature/pipeline-step1</w:t>
+      </w:r>
+      <w:r>
+        <w:rPr>
+          <w:b w:val="0"/>
+        </w:rPr>
+        <w:t>. Still read-only: nothing visits LinkedIn that did not before.</w:t>
+      </w:r>
+    </w:p>
+    <w:p>
+      <w:pPr>
+        <w:pStyle w:val="ListBullet"/>
+      </w:pPr>
+      <w:r>
+        <w:rPr>
+          <w:b/>
+        </w:rPr>
+        <w:t>`code/readiness.js`</w:t>
+      </w:r>
+      <w:r>
+        <w:rPr>
+          <w:b w:val="0"/>
+        </w:rPr>
+        <w:t xml:space="preserve"> (pure): </w:t>
+      </w:r>
+      <w:r>
+        <w:rPr>
+          <w:rFonts w:ascii="Consolas" w:hAnsi="Consolas"/>
+          <w:b w:val="0"/>
+        </w:rPr>
+        <w:t>assessAccount</w:t>
+      </w:r>
+      <w:r>
+        <w:rPr>
+          <w:b w:val="0"/>
+        </w:rPr>
+        <w:t xml:space="preserve">, </w:t>
+      </w:r>
+      <w:r>
+        <w:rPr>
+          <w:rFonts w:ascii="Consolas" w:hAnsi="Consolas"/>
+          <w:b w:val="0"/>
+        </w:rPr>
+        <w:t>isScannable</w:t>
+      </w:r>
+      <w:r>
+        <w:rPr>
+          <w:b w:val="0"/>
+        </w:rPr>
+        <w:t xml:space="preserve">, </w:t>
+      </w:r>
+      <w:r>
+        <w:rPr>
+          <w:rFonts w:ascii="Consolas" w:hAnsi="Consolas"/>
+          <w:b w:val="0"/>
+        </w:rPr>
+        <w:t>requiredFields</w:t>
+      </w:r>
+      <w:r>
+        <w:rPr>
+          <w:b w:val="0"/>
+        </w:rPr>
+        <w:t xml:space="preserve">, </w:t>
+      </w:r>
+      <w:r>
+        <w:rPr>
+          <w:rFonts w:ascii="Consolas" w:hAnsi="Consolas"/>
+          <w:b w:val="0"/>
+        </w:rPr>
+        <w:t>deriveProvenance</w:t>
+      </w:r>
+      <w:r>
+        <w:rPr>
+          <w:b w:val="0"/>
+        </w:rPr>
+        <w:t>,</w:t>
+      </w:r>
+    </w:p>
+    <w:p>
+      <w:r>
+        <w:rPr>
+          <w:b w:val="0"/>
+        </w:rPr>
+        <w:t xml:space="preserve">  </w:t>
+      </w:r>
+      <w:r>
+        <w:rPr>
+          <w:rFonts w:ascii="Consolas" w:hAnsi="Consolas"/>
+          <w:b w:val="0"/>
+        </w:rPr>
+        <w:t>MIN_READY_TO_SCAN</w:t>
+      </w:r>
+      <w:r>
+        <w:rPr>
+          <w:b w:val="0"/>
+        </w:rPr>
+        <w:t xml:space="preserve">. </w:t>
+      </w:r>
+      <w:r>
+        <w:rPr>
+          <w:rFonts w:ascii="Consolas" w:hAnsi="Consolas"/>
+          <w:b w:val="0"/>
+        </w:rPr>
+        <w:t>test_pure_modules.py</w:t>
+      </w:r>
+      <w:r>
+        <w:rPr>
+          <w:b w:val="0"/>
+        </w:rPr>
+        <w:t xml:space="preserve"> covers it, including the 3.4 check that every Ready or</w:t>
+      </w:r>
+    </w:p>
+    <w:p>
+      <w:r>
+        <w:rPr>
+          <w:b w:val="0"/>
+        </w:rPr>
+        <w:t xml:space="preserve">  Usable account is one </w:t>
+      </w:r>
+      <w:r>
+        <w:rPr>
+          <w:rFonts w:ascii="Consolas" w:hAnsi="Consolas"/>
+          <w:b w:val="0"/>
+        </w:rPr>
+        <w:t>isScannable</w:t>
+      </w:r>
+      <w:r>
+        <w:rPr>
+          <w:b w:val="0"/>
+        </w:rPr>
+        <w:t xml:space="preserve"> accepts.</w:t>
+      </w:r>
+    </w:p>
+    <w:p>
+      <w:pPr>
+        <w:pStyle w:val="ListBullet"/>
+      </w:pPr>
+      <w:r>
+        <w:rPr>
+          <w:b/>
+        </w:rPr>
+        <w:t>`getAccountViews()`</w:t>
+      </w:r>
+      <w:r>
+        <w:rPr>
+          <w:b w:val="0"/>
+        </w:rPr>
+        <w:t xml:space="preserve"> in </w:t>
+      </w:r>
+      <w:r>
+        <w:rPr>
+          <w:rFonts w:ascii="Consolas" w:hAnsi="Consolas"/>
+          <w:b w:val="0"/>
+        </w:rPr>
+        <w:t>storage.js</w:t>
+      </w:r>
+      <w:r>
+        <w:rPr>
+          <w:b w:val="0"/>
+        </w:rPr>
+        <w:t xml:space="preserve"> is the one join. </w:t>
+      </w:r>
+      <w:r>
+        <w:rPr>
+          <w:rFonts w:ascii="Consolas" w:hAnsi="Consolas"/>
+          <w:b w:val="0"/>
+        </w:rPr>
+        <w:t>getAccountReadiness()</w:t>
+      </w:r>
+      <w:r>
+        <w:rPr>
+          <w:b w:val="0"/>
+        </w:rPr>
+        <w:t xml:space="preserve"> pairs each live</w:t>
+      </w:r>
+    </w:p>
+    <w:p>
+      <w:r>
+        <w:rPr>
+          <w:b w:val="0"/>
+        </w:rPr>
+        <w:t xml:space="preserve">  account with its assessment. </w:t>
+      </w:r>
+      <w:r>
+        <w:rPr>
+          <w:rFonts w:ascii="Consolas" w:hAnsi="Consolas"/>
+          <w:b w:val="0"/>
+        </w:rPr>
+        <w:t>getScanTargetCompanyIds</w:t>
+      </w:r>
+      <w:r>
+        <w:rPr>
+          <w:b w:val="0"/>
+        </w:rPr>
+        <w:t xml:space="preserve"> is rebuilt on </w:t>
+      </w:r>
+      <w:r>
+        <w:rPr>
+          <w:rFonts w:ascii="Consolas" w:hAnsi="Consolas"/>
+          <w:b w:val="0"/>
+        </w:rPr>
+        <w:t>isScannable</w:t>
+      </w:r>
+      <w:r>
+        <w:rPr>
+          <w:b w:val="0"/>
+        </w:rPr>
+        <w:t xml:space="preserve"> (defect 2.5.2).</w:t>
+      </w:r>
+    </w:p>
+    <w:p>
+      <w:pPr>
+        <w:pStyle w:val="ListBullet"/>
+      </w:pPr>
+      <w:r>
+        <w:rPr>
+          <w:b/>
+        </w:rPr>
+        <w:t>Provenance</w:t>
+      </w:r>
+      <w:r>
+        <w:rPr>
+          <w:b w:val="0"/>
+        </w:rPr>
+        <w:t xml:space="preserve"> is stored in </w:t>
+      </w:r>
+      <w:r>
+        <w:rPr>
+          <w:rFonts w:ascii="Consolas" w:hAnsi="Consolas"/>
+          <w:b w:val="0"/>
+        </w:rPr>
+        <w:t>extras[key].provenance</w:t>
+      </w:r>
+      <w:r>
+        <w:rPr>
+          <w:b w:val="0"/>
+        </w:rPr>
+        <w:t xml:space="preserve">. Each entry holds </w:t>
+      </w:r>
+      <w:r>
+        <w:rPr>
+          <w:rFonts w:ascii="Consolas" w:hAnsi="Consolas"/>
+          <w:b w:val="0"/>
+        </w:rPr>
+        <w:t>v</w:t>
+      </w:r>
+      <w:r>
+        <w:rPr>
+          <w:b w:val="0"/>
+        </w:rPr>
+        <w:t>, the value it vouches for.</w:t>
+      </w:r>
+    </w:p>
+    <w:p>
+      <w:r>
+        <w:rPr>
+          <w:b w:val="0"/>
+        </w:rPr>
+        <w:t xml:space="preserve">  An entry whose </w:t>
+      </w:r>
+      <w:r>
+        <w:rPr>
+          <w:rFonts w:ascii="Consolas" w:hAnsi="Consolas"/>
+          <w:b w:val="0"/>
+        </w:rPr>
+        <w:t>v</w:t>
+      </w:r>
+      <w:r>
+        <w:rPr>
+          <w:b w:val="0"/>
+        </w:rPr>
+        <w:t xml:space="preserve"> no longer matches the stored value is ignored, and the field's provenance is</w:t>
+      </w:r>
+    </w:p>
+    <w:p>
+      <w:r>
+        <w:rPr>
+          <w:b w:val="0"/>
+        </w:rPr>
+        <w:t xml:space="preserve">  derived again. So a re-import, a merge or an undo can never leave provenance vouching for a value</w:t>
+      </w:r>
+    </w:p>
+    <w:p>
+      <w:r>
+        <w:rPr>
+          <w:b w:val="0"/>
+        </w:rPr>
+        <w:t xml:space="preserve">  that has gone. The writers stamp provenance in the same write as the value: the resolver, the</w:t>
+      </w:r>
+    </w:p>
+    <w:p>
+      <w:r>
+        <w:rPr>
+          <w:b w:val="0"/>
+        </w:rPr>
+        <w:t xml:space="preserve">  Discovery id backfill, Fetch Company Size, accepted web findings (single and bulk) and manual edits.</w:t>
+      </w:r>
+    </w:p>
+    <w:p>
+      <w:pPr>
+        <w:pStyle w:val="ListBullet"/>
+      </w:pPr>
+      <w:r>
+        <w:rPr>
+          <w:b/>
+        </w:rPr>
+        <w:t>The stored-id re-check rule</w:t>
+      </w:r>
+      <w:r>
+        <w:rPr>
+          <w:b w:val="0"/>
+        </w:rPr>
+        <w:t xml:space="preserve"> (from the step 0 mismatch finding): </w:t>
+      </w:r>
+      <w:r>
+        <w:rPr>
+          <w:rFonts w:ascii="Consolas" w:hAnsi="Consolas"/>
+          <w:b w:val="0"/>
+        </w:rPr>
+        <w:t>linkedinCompanyId</w:t>
+      </w:r>
+      <w:r>
+        <w:rPr>
+          <w:b w:val="0"/>
+        </w:rPr>
+        <w:t xml:space="preserve"> counts as</w:t>
+      </w:r>
+    </w:p>
+    <w:p>
+      <w:r>
+        <w:rPr>
+          <w:b w:val="0"/>
+        </w:rPr>
+        <w:t xml:space="preserve">  verified only when its provenance records the page the id was read from (</w:t>
+      </w:r>
+      <w:r>
+        <w:rPr>
+          <w:rFonts w:ascii="Consolas" w:hAnsi="Consolas"/>
+          <w:b w:val="0"/>
+        </w:rPr>
+        <w:t>link</w:t>
+      </w:r>
+      <w:r>
+        <w:rPr>
+          <w:b w:val="0"/>
+        </w:rPr>
+        <w:t>), and that page is</w:t>
+      </w:r>
+    </w:p>
+    <w:p>
+      <w:r>
+        <w:rPr>
+          <w:b w:val="0"/>
+        </w:rPr>
+        <w:t xml:space="preserve">  the account's current LinkedIn link. Ids stored before 1.2 carry no such record, so they show as</w:t>
+      </w:r>
+    </w:p>
+    <w:p>
+      <w:r>
+        <w:rPr>
+          <w:b w:val="0"/>
+        </w:rPr>
+        <w:t xml:space="preserve">  *not yet re-checked* and the account is </w:t>
+      </w:r>
+      <w:r>
+        <w:rPr>
+          <w:b/>
+        </w:rPr>
+        <w:t>Usable, not Ready</w:t>
+      </w:r>
+      <w:r>
+        <w:rPr>
+          <w:b w:val="0"/>
+        </w:rPr>
+        <w:t>, until step 2's pipeline re-reads</w:t>
+      </w:r>
+    </w:p>
+    <w:p>
+      <w:r>
+        <w:rPr>
+          <w:b w:val="0"/>
+        </w:rPr>
+        <w:t xml:space="preserve">  them. A re-import that changes an account's link invalidates its id the same way. Discovered rows</w:t>
+      </w:r>
+    </w:p>
+    <w:p>
+      <w:r>
+        <w:rPr>
+          <w:b w:val="0"/>
+        </w:rPr>
+        <w:t xml:space="preserve">  are the exception: their id and link come off the same search card.</w:t>
+      </w:r>
+    </w:p>
+    <w:p>
+      <w:pPr>
+        <w:pStyle w:val="ListBullet"/>
+      </w:pPr>
+      <w:r>
+        <w:rPr>
+          <w:b/>
+        </w:rPr>
+        <w:t>Defect 2.5.1:</w:t>
+      </w:r>
+      <w:r>
+        <w:rPr>
+          <w:b w:val="0"/>
+        </w:rPr>
+        <w:t xml:space="preserve"> </w:t>
+      </w:r>
+      <w:r>
+        <w:rPr>
+          <w:rFonts w:ascii="Consolas" w:hAnsi="Consolas"/>
+          <w:b w:val="0"/>
+        </w:rPr>
+        <w:t>getCompaniesNeedingSize</w:t>
+      </w:r>
+      <w:r>
+        <w:rPr>
+          <w:b w:val="0"/>
+        </w:rPr>
+        <w:t xml:space="preserve"> uses </w:t>
+      </w:r>
+      <w:r>
+        <w:rPr>
+          <w:rFonts w:ascii="Consolas" w:hAnsi="Consolas"/>
+          <w:b w:val="0"/>
+        </w:rPr>
+        <w:t>parseLooseNumber</w:t>
+      </w:r>
+      <w:r>
+        <w:rPr>
+          <w:b w:val="0"/>
+        </w:rPr>
+        <w:t>.</w:t>
+      </w:r>
+    </w:p>
+    <w:p>
+      <w:pPr>
+        <w:pStyle w:val="ListBullet"/>
+      </w:pPr>
+      <w:r>
+        <w:rPr>
+          <w:b/>
+        </w:rPr>
+        <w:t>Defect 2.5.3, as far as step 1 can go without the scheduler:</w:t>
+      </w:r>
+      <w:r>
+        <w:rPr>
+          <w:b w:val="0"/>
+        </w:rPr>
+        <w:t xml:space="preserve"> the automatic scoring now also</w:t>
+      </w:r>
+    </w:p>
+    <w:p>
+      <w:r>
+        <w:rPr>
+          <w:b w:val="0"/>
+        </w:rPr>
+        <w:t xml:space="preserve">  re-scores locally computed priorities. It runs after an import or merge, after contact discovery,</w:t>
+      </w:r>
+    </w:p>
+    <w:p>
+      <w:r>
+        <w:rPr>
+          <w:b w:val="0"/>
+        </w:rPr>
+        <w:t xml:space="preserve">  after Fetch Company Size, and on opening Target Accounts. It never touches a manual override or an</w:t>
+      </w:r>
+    </w:p>
+    <w:p>
+      <w:r>
+        <w:rPr>
+          <w:b w:val="0"/>
+        </w:rPr>
+        <w:t xml:space="preserve">  AI-judged score (its reason contains "Strategic Fit:"). Only companies whose score moved are</w:t>
+      </w:r>
+    </w:p>
+    <w:p>
+      <w:r>
+        <w:rPr>
+          <w:b w:val="0"/>
+        </w:rPr>
+        <w:t xml:space="preserve">  written.</w:t>
+      </w:r>
+    </w:p>
+    <w:p>
+      <w:pPr>
+        <w:pStyle w:val="ListBullet"/>
+      </w:pPr>
+      <w:r>
+        <w:rPr>
+          <w:b/>
+        </w:rPr>
+        <w:t>UI:</w:t>
+      </w:r>
+      <w:r>
+        <w:rPr>
+          <w:b w:val="0"/>
+        </w:rPr>
+        <w:t xml:space="preserve"> a first pie, </w:t>
+      </w:r>
+      <w:r>
+        <w:rPr>
+          <w:b/>
+        </w:rPr>
+        <w:t>Pipeline status</w:t>
+      </w:r>
+      <w:r>
+        <w:rPr>
+          <w:b w:val="0"/>
+        </w:rPr>
+        <w:t>, on the Target Accounts dashboard, with a one-line count</w:t>
+      </w:r>
+    </w:p>
+    <w:p>
+      <w:r>
+        <w:rPr>
+          <w:b w:val="0"/>
+        </w:rPr>
+        <w:t xml:space="preserve">  under it. Clicking a slice filters the table by the new </w:t>
+      </w:r>
+      <w:r>
+        <w:rPr>
+          <w:b/>
+        </w:rPr>
+        <w:t>Readiness</w:t>
+      </w:r>
+      <w:r>
+        <w:rPr>
+          <w:b w:val="0"/>
+        </w:rPr>
+        <w:t xml:space="preserve"> column, and hovering a</w:t>
+      </w:r>
+    </w:p>
+    <w:p>
+      <w:r>
+        <w:rPr>
+          <w:b w:val="0"/>
+        </w:rPr>
+        <w:t xml:space="preserve">  Readiness pill lists what the account still lacks. Both are redrawn, debounced, when any account</w:t>
+      </w:r>
+    </w:p>
+    <w:p>
+      <w:r>
+        <w:rPr>
+          <w:b w:val="0"/>
+        </w:rPr>
+        <w:t xml:space="preserve">  store or the targeting settings change.</w:t>
+      </w:r>
+    </w:p>
+    <w:p>
+      <w:r>
+        <w:rPr>
+          <w:b/>
+        </w:rPr>
+        <w:t>Differences from the design text, found in the code:</w:t>
+      </w:r>
+    </w:p>
+    <w:p>
+      <w:pPr>
+        <w:pStyle w:val="ListNumber"/>
+      </w:pPr>
+      <w:r>
+        <w:rPr>
+          <w:b w:val="0"/>
+        </w:rPr>
+        <w:t xml:space="preserve">Contacts: </w:t>
+      </w:r>
+      <w:r>
+        <w:rPr>
+          <w:rFonts w:ascii="Consolas" w:hAnsi="Consolas"/>
+          <w:b w:val="0"/>
+        </w:rPr>
+        <w:t>lastVerified2</w:t>
+      </w:r>
+      <w:r>
+        <w:rPr>
+          <w:b w:val="0"/>
+        </w:rPr>
+        <w:t xml:space="preserve"> is the LinkedIn </w:t>
+      </w:r>
+      <w:r>
+        <w:rPr>
+          <w:b/>
+        </w:rPr>
+        <w:t>profile URL</w:t>
+      </w:r>
+      <w:r>
+        <w:rPr>
+          <w:b w:val="0"/>
+        </w:rPr>
+        <w:t>, not a second date (section 4.1 assumed</w:t>
+      </w:r>
+    </w:p>
+    <w:p>
+      <w:r>
+        <w:rPr>
+          <w:b w:val="0"/>
+        </w:rPr>
+        <w:t xml:space="preserve">   two dates). The contact's date is </w:t>
+      </w:r>
+      <w:r>
+        <w:rPr>
+          <w:rFonts w:ascii="Consolas" w:hAnsi="Consolas"/>
+          <w:b w:val="0"/>
+        </w:rPr>
+        <w:t>lastVerified</w:t>
+      </w:r>
+      <w:r>
+        <w:rPr>
+          <w:b w:val="0"/>
+        </w:rPr>
+        <w:t>. Discovered contacts had no date at all: they now</w:t>
+      </w:r>
+    </w:p>
+    <w:p>
+      <w:r>
+        <w:rPr>
+          <w:b w:val="0"/>
+        </w:rPr>
+        <w:t xml:space="preserve">   get the day they were found, and older ones fall back to the account's</w:t>
+      </w:r>
+    </w:p>
+    <w:p>
+      <w:r>
+        <w:rPr>
+          <w:b w:val="0"/>
+        </w:rPr>
+        <w:t xml:space="preserve">   </w:t>
+      </w:r>
+      <w:r>
+        <w:rPr>
+          <w:rFonts w:ascii="Consolas" w:hAnsi="Consolas"/>
+          <w:b w:val="0"/>
+        </w:rPr>
+        <w:t>contactDiscoveryAttemptedAt</w:t>
+      </w:r>
+      <w:r>
+        <w:rPr>
+          <w:b w:val="0"/>
+        </w:rPr>
+        <w:t>, then the import date.</w:t>
+      </w:r>
+    </w:p>
+    <w:p>
+      <w:pPr>
+        <w:pStyle w:val="ListNumber"/>
+      </w:pPr>
+      <w:r>
+        <w:rPr>
+          <w:b w:val="0"/>
+        </w:rPr>
+        <w:t xml:space="preserve">Discovered companies keep their LinkedIn id on the workbook row, not in the </w:t>
+      </w:r>
+      <w:r>
+        <w:rPr>
+          <w:rFonts w:ascii="Consolas" w:hAnsi="Consolas"/>
+          <w:b w:val="0"/>
+        </w:rPr>
+        <w:t>targetAccounts</w:t>
+      </w:r>
+      <w:r>
+        <w:rPr>
+          <w:b w:val="0"/>
+        </w:rPr>
+        <w:t xml:space="preserve"> map,</w:t>
+      </w:r>
+    </w:p>
+    <w:p>
+      <w:r>
+        <w:rPr>
+          <w:b w:val="0"/>
+        </w:rPr>
+        <w:t xml:space="preserve">   so the old scan selection never scanned them. </w:t>
+      </w:r>
+      <w:r>
+        <w:rPr>
+          <w:rFonts w:ascii="Consolas" w:hAnsi="Consolas"/>
+          <w:b w:val="0"/>
+        </w:rPr>
+        <w:t>getAccountViews</w:t>
+      </w:r>
+      <w:r>
+        <w:rPr>
+          <w:b w:val="0"/>
+        </w:rPr>
+        <w:t xml:space="preserve"> reads both, so **Discovered</w:t>
+      </w:r>
+    </w:p>
+    <w:p>
+      <w:r>
+        <w:rPr>
+          <w:b w:val="0"/>
+        </w:rPr>
+        <w:t xml:space="preserve">   companies with a P1–P3 priority are now scanned.**</w:t>
+      </w:r>
+    </w:p>
+    <w:p>
+      <w:pPr>
+        <w:pStyle w:val="ListNumber"/>
+      </w:pPr>
+      <w:r>
+        <w:rPr>
+          <w:b w:val="0"/>
+        </w:rPr>
+        <w:t xml:space="preserve">Scope "all" now needs a P1–P5 priority, per </w:t>
+      </w:r>
+      <w:r>
+        <w:rPr>
+          <w:rFonts w:ascii="Consolas" w:hAnsi="Consolas"/>
+          <w:b w:val="0"/>
+        </w:rPr>
+        <w:t>isScannable</w:t>
+      </w:r>
+      <w:r>
+        <w:rPr>
+          <w:b w:val="0"/>
+        </w:rPr>
+        <w:t>. Before, it also took unscored</w:t>
+      </w:r>
+    </w:p>
+    <w:p>
+      <w:r>
+        <w:rPr>
+          <w:b w:val="0"/>
+        </w:rPr>
+        <w:t xml:space="preserve">   companies. The automatic scoring leaves almost none unscored.</w:t>
+      </w:r>
+    </w:p>
+    <w:p>
+      <w:pPr>
+        <w:pStyle w:val="ListNumber"/>
+      </w:pPr>
+      <w:r>
+        <w:rPr>
+          <w:b w:val="0"/>
+        </w:rPr>
+        <w:t>With no seniority levels set in the wizard, any contact counts as relevant, rather than none.</w:t>
+      </w:r>
+    </w:p>
+    <w:p>
+      <w:pPr>
+        <w:pStyle w:val="ListNumber"/>
+      </w:pPr>
+      <w:r>
+        <w:rPr>
+          <w:b w:val="0"/>
+        </w:rPr>
+        <w:t>Excluded accounts are left out of the pie, the same as deleted ones. The table already hides both.</w:t>
+      </w:r>
+    </w:p>
+    <w:p>
+      <w:r>
+        <w:rPr>
+          <w:b/>
+        </w:rPr>
+        <w:t>Added during the live test (2026-09-25, build 1.1.4):</w:t>
+      </w:r>
+    </w:p>
+    <w:p>
+      <w:pPr>
+        <w:pStyle w:val="ListNumber"/>
+      </w:pPr>
+      <w:r>
+        <w:rPr>
+          <w:b/>
+        </w:rPr>
+        <w:t>Contact relevance reads the research's own Seniority column first</w:t>
+      </w:r>
+      <w:r>
+        <w:rPr>
+          <w:b w:val="0"/>
+        </w:rPr>
+        <w:t xml:space="preserve"> ("C-level / Group",</w:t>
+      </w:r>
+    </w:p>
+    <w:p>
+      <w:r>
+        <w:rPr>
+          <w:b w:val="0"/>
+        </w:rPr>
+        <w:t xml:space="preserve">   "Specialist"…). The job-title guess is used only for contacts without it. Any "Chief … Officer"</w:t>
+      </w:r>
+    </w:p>
+    <w:p>
+      <w:r>
+        <w:rPr>
+          <w:b w:val="0"/>
+        </w:rPr>
+        <w:t xml:space="preserve">   title now counts as C-level, both here and in LinkedIn Discovery's headline check. Before, a title such</w:t>
+      </w:r>
+    </w:p>
+    <w:p>
+      <w:r>
+        <w:rPr>
+          <w:b w:val="0"/>
+        </w:rPr>
+        <w:t xml:space="preserve">   as "Chief Digital &amp; Information Officer" matched no level.</w:t>
+      </w:r>
+    </w:p>
+    <w:p>
+      <w:pPr>
+        <w:pStyle w:val="ListNumber"/>
+      </w:pPr>
+      <w:r>
+        <w:rPr>
+          <w:b/>
+        </w:rPr>
+        <w:t>The contact column "LinkedIn Profile" is now "Contact Link".</w:t>
+      </w:r>
+      <w:r>
+        <w:rPr>
+          <w:b w:val="0"/>
+        </w:rPr>
+        <w:t xml:space="preserve"> The research fills it with any</w:t>
+      </w:r>
+    </w:p>
+    <w:p>
+      <w:r>
+        <w:rPr>
+          <w:b w:val="0"/>
+        </w:rPr>
+        <w:t xml:space="preserve">   page that evidences the person, often a news article. The link says "LinkedIn ↗" only for a real</w:t>
+      </w:r>
+    </w:p>
+    <w:p>
+      <w:r>
+        <w:rPr>
+          <w:b w:val="0"/>
+        </w:rPr>
+        <w:t xml:space="preserve">   profile; any other page shows its site name. Readiness applies the same test.</w:t>
+      </w:r>
+    </w:p>
+    <w:p>
+      <w:pPr>
+        <w:pStyle w:val="ListNumber"/>
+      </w:pPr>
+      <w:r>
+        <w:rPr>
+          <w:b/>
+        </w:rPr>
+        <w:t>A "Still to do" line under the pie</w:t>
+      </w:r>
+      <w:r>
+        <w:rPr>
+          <w:b w:val="0"/>
+        </w:rPr>
+        <w:t xml:space="preserve"> counts the gaps per field. The first live reading was:</w:t>
+      </w:r>
+    </w:p>
+    <w:p>
+      <w:r>
+        <w:rPr>
+          <w:b w:val="0"/>
+        </w:rPr>
+        <w:t xml:space="preserve">   LinkedIn re-check 533, relevant contact not verified (no LinkedIn profile) 289, employees not</w:t>
+      </w:r>
+    </w:p>
+    <w:p>
+      <w:r>
+        <w:rPr>
+          <w:b w:val="0"/>
+        </w:rPr>
+        <w:t xml:space="preserve">   verified 88, relevant contact missing 78, LinkedIn company missing 1.</w:t>
+      </w:r>
+    </w:p>
+    <w:p>
+      <w:pPr>
+        <w:pStyle w:val="ListNumber"/>
+      </w:pPr>
+      <w:r>
+        <w:rPr>
+          <w:b/>
+        </w:rPr>
+        <w:t>For step 2:</w:t>
+      </w:r>
+      <w:r>
+        <w:rPr>
+          <w:b w:val="0"/>
+        </w:rPr>
+        <w:t xml:space="preserve"> the 289 accounts already know the senior person's name. Finding that one person's</w:t>
+      </w:r>
+    </w:p>
+    <w:p>
+      <w:r>
+        <w:rPr>
+          <w:b w:val="0"/>
+        </w:rPr>
+        <w:t xml:space="preserve">   LinkedIn profile is a narrower, likely cheaper job than a People-tab discovery, and should be</w:t>
+      </w:r>
+    </w:p>
+    <w:p>
+      <w:r>
+        <w:rPr>
+          <w:b w:val="0"/>
+        </w:rPr>
+        <w:t xml:space="preserve">   designed as its own job.</w:t>
       </w:r>
     </w:p>
     <w:p>

</xml_diff>

<commit_message>
1.1.6 / 1.2.0 step 3: automatic pipeline
Consent (wizard last step, one-time question, Settings > Automation, off by
default); automatic triggers (Chrome start, page open + every 10 min, end of
a user's job, Setup saved); the pipeline makes way for any user job; backup
from the last 24h required; status line under the Pipeline status pie and in
Settings; pill with Pause for today; Scanner gate (0 Ready blocks, 1-4 warn).
Pipeline visit ceiling lowered 75 -> 60. Touch-ups U1-U6 in
DATA_PIPELINE_DESIGN.md.

Co-Authored-By: Claude Opus 5.5 <noreply@anthropic.com>
</commit_message>
<xml_diff>
--- a/DATA_PIPELINE_DESIGN.docx
+++ b/DATA_PIPELINE_DESIGN.docx
@@ -11400,6 +11400,989 @@
           <w:b w:val="0"/>
         </w:rPr>
         <w:t xml:space="preserve">   the id there.</w:t>
+      </w:r>
+    </w:p>
+    <w:p>
+      <w:pPr>
+        <w:pStyle w:val="Heading3"/>
+      </w:pPr>
+      <w:r>
+        <w:rPr>
+          <w:b w:val="0"/>
+        </w:rPr>
+        <w:t>Step 3 touch-ups (agreed 2026-09-25)</w:t>
+      </w:r>
+    </w:p>
+    <w:p>
+      <w:r>
+        <w:rPr>
+          <w:b w:val="0"/>
+        </w:rPr>
+        <w:t>Boaz agreed to all six as recommended.</w:t>
+      </w:r>
+    </w:p>
+    <w:tbl>
+      <w:tblPr>
+        <w:tblStyle w:val="TableGrid"/>
+        <w:tblW w:type="auto" w:w="0"/>
+        <w:tblLook w:firstColumn="1" w:firstRow="1" w:lastColumn="0" w:lastRow="0" w:noHBand="0" w:noVBand="1" w:val="04A0"/>
+      </w:tblPr>
+      <w:tblGrid>
+        <w:gridCol w:w="2880"/>
+        <w:gridCol w:w="2880"/>
+        <w:gridCol w:w="2880"/>
+      </w:tblGrid>
+      <w:tr>
+        <w:tc>
+          <w:tcPr>
+            <w:tcW w:type="dxa" w:w="2880"/>
+          </w:tcPr>
+          <w:p>
+            <w:r/>
+            <w:r>
+              <w:rPr>
+                <w:b/>
+              </w:rPr>
+              <w:t>#</w:t>
+            </w:r>
+          </w:p>
+        </w:tc>
+        <w:tc>
+          <w:tcPr>
+            <w:tcW w:type="dxa" w:w="2880"/>
+          </w:tcPr>
+          <w:p>
+            <w:r/>
+            <w:r>
+              <w:rPr>
+                <w:b/>
+              </w:rPr>
+              <w:t>Question</w:t>
+            </w:r>
+          </w:p>
+        </w:tc>
+        <w:tc>
+          <w:tcPr>
+            <w:tcW w:type="dxa" w:w="2880"/>
+          </w:tcPr>
+          <w:p>
+            <w:r/>
+            <w:r>
+              <w:rPr>
+                <w:b/>
+              </w:rPr>
+              <w:t>Decision</w:t>
+            </w:r>
+          </w:p>
+        </w:tc>
+      </w:tr>
+      <w:tr>
+        <w:tc>
+          <w:tcPr>
+            <w:tcW w:type="dxa" w:w="2880"/>
+          </w:tcPr>
+          <w:p>
+            <w:r/>
+            <w:r>
+              <w:rPr>
+                <w:b/>
+              </w:rPr>
+              <w:t>U1</w:t>
+            </w:r>
+          </w:p>
+        </w:tc>
+        <w:tc>
+          <w:tcPr>
+            <w:tcW w:type="dxa" w:w="2880"/>
+          </w:tcPr>
+          <w:p>
+            <w:r/>
+            <w:r>
+              <w:rPr>
+                <w:b w:val="0"/>
+              </w:rPr>
+              <w:t>Only a page can save the daily backup (the background worker cannot write files). What if Chrome starts with no SalesTeam page open?</w:t>
+            </w:r>
+          </w:p>
+        </w:tc>
+        <w:tc>
+          <w:tcPr>
+            <w:tcW w:type="dxa" w:w="2880"/>
+          </w:tcPr>
+          <w:p>
+            <w:r/>
+            <w:r>
+              <w:rPr>
+                <w:b w:val="0"/>
+              </w:rPr>
+              <w:t xml:space="preserve">An automatic run starts only with a full backup from the </w:t>
+            </w:r>
+            <w:r>
+              <w:rPr>
+                <w:b/>
+              </w:rPr>
+              <w:t>last 24 hours</w:t>
+            </w:r>
+            <w:r>
+              <w:rPr>
+                <w:b w:val="0"/>
+              </w:rPr>
+              <w:t>. Without one it waits for the first SalesTeam page, which makes the backup (the same 12-hour rule as before a scan) and then kicks</w:t>
+            </w:r>
+          </w:p>
+        </w:tc>
+      </w:tr>
+      <w:tr>
+        <w:tc>
+          <w:tcPr>
+            <w:tcW w:type="dxa" w:w="2880"/>
+          </w:tcPr>
+          <w:p>
+            <w:r/>
+            <w:r>
+              <w:rPr>
+                <w:b/>
+              </w:rPr>
+              <w:t>U2</w:t>
+            </w:r>
+          </w:p>
+        </w:tc>
+        <w:tc>
+          <w:tcPr>
+            <w:tcW w:type="dxa" w:w="2880"/>
+          </w:tcPr>
+          <w:p>
+            <w:r/>
+            <w:r>
+              <w:rPr>
+                <w:b w:val="0"/>
+              </w:rPr>
+              <w:t>The design pauses the pipeline only for a scan</w:t>
+            </w:r>
+          </w:p>
+        </w:tc>
+        <w:tc>
+          <w:tcPr>
+            <w:tcW w:type="dxa" w:w="2880"/>
+          </w:tcPr>
+          <w:p>
+            <w:r/>
+            <w:r>
+              <w:rPr>
+                <w:b w:val="0"/>
+              </w:rPr>
+              <w:t xml:space="preserve">It makes way for </w:t>
+            </w:r>
+            <w:r>
+              <w:rPr>
+                <w:b/>
+              </w:rPr>
+              <w:t>any</w:t>
+            </w:r>
+            <w:r>
+              <w:rPr>
+                <w:b w:val="0"/>
+              </w:rPr>
+              <w:t xml:space="preserve"> job the user starts: a scan, web research, Discovery, the Advanced-tools runners. Start asks it to pause, a note says *"Waiting for SalesTeam to finish the account in progress…"*, and the job starts when it has. No "one batch at a time" refusal because of the pipeline. When the job ends, the pipeline resumes by itself</w:t>
+            </w:r>
+          </w:p>
+        </w:tc>
+      </w:tr>
+      <w:tr>
+        <w:tc>
+          <w:tcPr>
+            <w:tcW w:type="dxa" w:w="2880"/>
+          </w:tcPr>
+          <w:p>
+            <w:r/>
+            <w:r>
+              <w:rPr>
+                <w:b/>
+              </w:rPr>
+              <w:t>U3</w:t>
+            </w:r>
+          </w:p>
+        </w:tc>
+        <w:tc>
+          <w:tcPr>
+            <w:tcW w:type="dxa" w:w="2880"/>
+          </w:tcPr>
+          <w:p>
+            <w:r/>
+            <w:r>
+              <w:rPr>
+                <w:b w:val="0"/>
+              </w:rPr>
+              <w:t>A pop-up after every automatic run would be intrusive</w:t>
+            </w:r>
+          </w:p>
+        </w:tc>
+        <w:tc>
+          <w:tcPr>
+            <w:tcW w:type="dxa" w:w="2880"/>
+          </w:tcPr>
+          <w:p>
+            <w:r/>
+            <w:r>
+              <w:rPr>
+                <w:b w:val="0"/>
+              </w:rPr>
+              <w:t xml:space="preserve">Automatic runs show </w:t>
+            </w:r>
+            <w:r>
+              <w:rPr>
+                <w:b/>
+              </w:rPr>
+              <w:t>no pop-up</w:t>
+            </w:r>
+            <w:r>
+              <w:rPr>
+                <w:b w:val="0"/>
+              </w:rPr>
+              <w:t xml:space="preserve">. What they did goes to the Activity Log and to one status line under the Pipeline status pie (10.2). The pill reads *"Preparing accounts · 21 ready · Nestlé"*, with </w:t>
+            </w:r>
+            <w:r>
+              <w:rPr>
+                <w:b/>
+              </w:rPr>
+              <w:t>Pause</w:t>
+            </w:r>
+            <w:r>
+              <w:rPr>
+                <w:b w:val="0"/>
+              </w:rPr>
+              <w:t xml:space="preserve">. A manual </w:t>
+            </w:r>
+            <w:r>
+              <w:rPr>
+                <w:b/>
+              </w:rPr>
+              <w:t>Run pipeline now</w:t>
+            </w:r>
+            <w:r>
+              <w:rPr>
+                <w:b w:val="0"/>
+              </w:rPr>
+              <w:t xml:space="preserve"> keeps its pop-up</w:t>
+            </w:r>
+          </w:p>
+        </w:tc>
+      </w:tr>
+      <w:tr>
+        <w:tc>
+          <w:tcPr>
+            <w:tcW w:type="dxa" w:w="2880"/>
+          </w:tcPr>
+          <w:p>
+            <w:r/>
+            <w:r>
+              <w:rPr>
+                <w:b/>
+              </w:rPr>
+              <w:t>U4</w:t>
+            </w:r>
+          </w:p>
+        </w:tc>
+        <w:tc>
+          <w:tcPr>
+            <w:tcW w:type="dxa" w:w="2880"/>
+          </w:tcPr>
+          <w:p>
+            <w:r/>
+            <w:r>
+              <w:rPr>
+                <w:b w:val="0"/>
+              </w:rPr>
+              <w:t>The Scanner gate (fewer than 5 Ready): the Scanner also searches topics, and only one of its three phases uses accounts</w:t>
+            </w:r>
+          </w:p>
+        </w:tc>
+        <w:tc>
+          <w:tcPr>
+            <w:tcW w:type="dxa" w:w="2880"/>
+          </w:tcPr>
+          <w:p>
+            <w:r/>
+            <w:r>
+              <w:rPr>
+                <w:b/>
+              </w:rPr>
+              <w:t>0 Ready blocks</w:t>
+            </w:r>
+            <w:r>
+              <w:rPr>
+                <w:b w:val="0"/>
+              </w:rPr>
+              <w:t xml:space="preserve"> the scan, with the reason. </w:t>
+            </w:r>
+            <w:r>
+              <w:rPr>
+                <w:b/>
+              </w:rPr>
+              <w:t>1-4 Ready: a soft gate</w:t>
+            </w:r>
+            <w:r>
+              <w:rPr>
+                <w:b w:val="0"/>
+              </w:rPr>
+              <w:t xml:space="preserve">, the Scanner explains and offers </w:t>
+            </w:r>
+            <w:r>
+              <w:rPr>
+                <w:b/>
+              </w:rPr>
+              <w:t>Scan anyway</w:t>
+            </w:r>
+            <w:r>
+              <w:rPr>
+                <w:b w:val="0"/>
+              </w:rPr>
+              <w:t>. 5 or more: scans straight away. (Refined by Boaz 2026-09-25; first agreed as a soft gate at every count)</w:t>
+            </w:r>
+          </w:p>
+        </w:tc>
+      </w:tr>
+      <w:tr>
+        <w:tc>
+          <w:tcPr>
+            <w:tcW w:type="dxa" w:w="2880"/>
+          </w:tcPr>
+          <w:p>
+            <w:r/>
+            <w:r>
+              <w:rPr>
+                <w:b/>
+              </w:rPr>
+              <w:t>U5</w:t>
+            </w:r>
+          </w:p>
+        </w:tc>
+        <w:tc>
+          <w:tcPr>
+            <w:tcW w:type="dxa" w:w="2880"/>
+          </w:tcPr>
+          <w:p>
+            <w:r/>
+            <w:r>
+              <w:rPr>
+                <w:b w:val="0"/>
+              </w:rPr>
+              <w:t>Consent and the default</w:t>
+            </w:r>
+          </w:p>
+        </w:tc>
+        <w:tc>
+          <w:tcPr>
+            <w:tcW w:type="dxa" w:w="2880"/>
+          </w:tcPr>
+          <w:p>
+            <w:r/>
+            <w:r>
+              <w:rPr>
+                <w:b/>
+              </w:rPr>
+              <w:t>Off</w:t>
+            </w:r>
+            <w:r>
+              <w:rPr>
+                <w:b w:val="0"/>
+              </w:rPr>
+              <w:t xml:space="preserve"> until turned on. Asked at the end of the setup wizard, and once for existing users on the first SalesTeam page they open after updating. The switch lives in </w:t>
+            </w:r>
+            <w:r>
+              <w:rPr>
+                <w:b/>
+              </w:rPr>
+              <w:t>Settings &gt; Automation</w:t>
+            </w:r>
+            <w:r>
+              <w:rPr>
+                <w:b w:val="0"/>
+              </w:rPr>
+              <w:t>. The web-research line waits for step 5. No keep-awake (D4)</w:t>
+            </w:r>
+          </w:p>
+        </w:tc>
+      </w:tr>
+      <w:tr>
+        <w:tc>
+          <w:tcPr>
+            <w:tcW w:type="dxa" w:w="2880"/>
+          </w:tcPr>
+          <w:p>
+            <w:r/>
+            <w:r>
+              <w:rPr>
+                <w:b/>
+              </w:rPr>
+              <w:t>U6</w:t>
+            </w:r>
+          </w:p>
+        </w:tc>
+        <w:tc>
+          <w:tcPr>
+            <w:tcW w:type="dxa" w:w="2880"/>
+          </w:tcPr>
+          <w:p>
+            <w:r/>
+            <w:r>
+              <w:rPr>
+                <w:b w:val="0"/>
+              </w:rPr>
+              <w:t>Version</w:t>
+            </w:r>
+          </w:p>
+        </w:tc>
+        <w:tc>
+          <w:tcPr>
+            <w:tcW w:type="dxa" w:w="2880"/>
+          </w:tcPr>
+          <w:p>
+            <w:r/>
+            <w:r>
+              <w:rPr>
+                <w:b w:val="0"/>
+              </w:rPr>
+              <w:t xml:space="preserve">1.1.5 → </w:t>
+            </w:r>
+            <w:r>
+              <w:rPr>
+                <w:b/>
+              </w:rPr>
+              <w:t>1.1.6</w:t>
+            </w:r>
+          </w:p>
+        </w:tc>
+      </w:tr>
+    </w:tbl>
+    <w:p/>
+    <w:p>
+      <w:pPr>
+        <w:pStyle w:val="Heading3"/>
+      </w:pPr>
+      <w:r>
+        <w:rPr>
+          <w:b w:val="0"/>
+        </w:rPr>
+        <w:t>Step 3 as built (2026-09-25)</w:t>
+      </w:r>
+    </w:p>
+    <w:p>
+      <w:r>
+        <w:rPr>
+          <w:b w:val="0"/>
+        </w:rPr>
+        <w:t xml:space="preserve">Branch </w:t>
+      </w:r>
+      <w:r>
+        <w:rPr>
+          <w:rFonts w:ascii="Consolas" w:hAnsi="Consolas"/>
+          <w:b w:val="0"/>
+        </w:rPr>
+        <w:t>feature/pipeline-step3</w:t>
+      </w:r>
+      <w:r>
+        <w:rPr>
+          <w:b w:val="0"/>
+        </w:rPr>
+        <w:t>, stacked on step 2. Version 1.1.6.</w:t>
+      </w:r>
+    </w:p>
+    <w:p>
+      <w:pPr>
+        <w:pStyle w:val="ListBullet"/>
+      </w:pPr>
+      <w:r>
+        <w:rPr>
+          <w:b/>
+        </w:rPr>
+        <w:t>`code/pipeline-automation.js`</w:t>
+      </w:r>
+      <w:r>
+        <w:rPr>
+          <w:b w:val="0"/>
+        </w:rPr>
+        <w:t xml:space="preserve"> holds the switch (</w:t>
+      </w:r>
+      <w:r>
+        <w:rPr>
+          <w:rFonts w:ascii="Consolas" w:hAnsi="Consolas"/>
+          <w:b w:val="0"/>
+        </w:rPr>
+        <w:t>pipelineAutomation</w:t>
+      </w:r>
+      <w:r>
+        <w:rPr>
+          <w:b w:val="0"/>
+        </w:rPr>
+        <w:t xml:space="preserve">: </w:t>
+      </w:r>
+      <w:r>
+        <w:rPr>
+          <w:rFonts w:ascii="Consolas" w:hAnsi="Consolas"/>
+          <w:b w:val="0"/>
+        </w:rPr>
+        <w:t>enabled</w:t>
+      </w:r>
+      <w:r>
+        <w:rPr>
+          <w:b w:val="0"/>
+        </w:rPr>
+        <w:t xml:space="preserve">, </w:t>
+      </w:r>
+      <w:r>
+        <w:rPr>
+          <w:rFonts w:ascii="Consolas" w:hAnsi="Consolas"/>
+          <w:b w:val="0"/>
+        </w:rPr>
+        <w:t>decidedAt</w:t>
+      </w:r>
+      <w:r>
+        <w:rPr>
+          <w:b w:val="0"/>
+        </w:rPr>
+        <w:t>,</w:t>
+      </w:r>
+    </w:p>
+    <w:p>
+      <w:r>
+        <w:rPr>
+          <w:b w:val="0"/>
+        </w:rPr>
+        <w:t xml:space="preserve">  </w:t>
+      </w:r>
+      <w:r>
+        <w:rPr>
+          <w:rFonts w:ascii="Consolas" w:hAnsi="Consolas"/>
+          <w:b w:val="0"/>
+        </w:rPr>
+        <w:t>askedAt</w:t>
+      </w:r>
+      <w:r>
+        <w:rPr>
+          <w:b w:val="0"/>
+        </w:rPr>
+        <w:t xml:space="preserve">, </w:t>
+      </w:r>
+      <w:r>
+        <w:rPr>
+          <w:rFonts w:ascii="Consolas" w:hAnsi="Consolas"/>
+          <w:b w:val="0"/>
+        </w:rPr>
+        <w:t>pausedDay</w:t>
+      </w:r>
+      <w:r>
+        <w:rPr>
+          <w:b w:val="0"/>
+        </w:rPr>
+        <w:t>), the consent wording, and the keys for the idle reason and the hold.</w:t>
+      </w:r>
+    </w:p>
+    <w:p>
+      <w:pPr>
+        <w:pStyle w:val="ListBullet"/>
+      </w:pPr>
+      <w:r>
+        <w:rPr>
+          <w:b/>
+        </w:rPr>
+        <w:t>`pipeline-plan.js` `autoRunBlocker`</w:t>
+      </w:r>
+      <w:r>
+        <w:rPr>
+          <w:b w:val="0"/>
+        </w:rPr>
+        <w:t xml:space="preserve"> (pure, tested) decides whether an automatic run may start:</w:t>
+      </w:r>
+    </w:p>
+    <w:p>
+      <w:r>
+        <w:rPr>
+          <w:b w:val="0"/>
+        </w:rPr>
+        <w:t xml:space="preserve">  off, paused for today, making way for a user's job, another batch running, the visit ceiling, no</w:t>
+      </w:r>
+    </w:p>
+    <w:p>
+      <w:r>
+        <w:rPr>
+          <w:b w:val="0"/>
+        </w:rPr>
+        <w:t xml:space="preserve">  backup from the last 24 hours. </w:t>
+      </w:r>
+      <w:r>
+        <w:rPr>
+          <w:rFonts w:ascii="Consolas" w:hAnsi="Consolas"/>
+          <w:b w:val="0"/>
+        </w:rPr>
+        <w:t>kickPipeline</w:t>
+      </w:r>
+      <w:r>
+        <w:rPr>
+          <w:b w:val="0"/>
+        </w:rPr>
+        <w:t xml:space="preserve"> then also checks that some account can be worked on</w:t>
+      </w:r>
+    </w:p>
+    <w:p>
+      <w:r>
+        <w:rPr>
+          <w:b w:val="0"/>
+        </w:rPr>
+        <w:t xml:space="preserve">  today, so a kick with nothing to do never opens the LinkedIn window.</w:t>
+      </w:r>
+    </w:p>
+    <w:p>
+      <w:pPr>
+        <w:pStyle w:val="ListBullet"/>
+      </w:pPr>
+      <w:r>
+        <w:rPr>
+          <w:b/>
+        </w:rPr>
+        <w:t>Triggers (5.4):</w:t>
+      </w:r>
+      <w:r>
+        <w:rPr>
+          <w:b w:val="0"/>
+        </w:rPr>
+        <w:t xml:space="preserve"> Chrome starts (</w:t>
+      </w:r>
+      <w:r>
+        <w:rPr>
+          <w:rFonts w:ascii="Consolas" w:hAnsi="Consolas"/>
+          <w:b w:val="0"/>
+        </w:rPr>
+        <w:t>onStartup</w:t>
+      </w:r>
+      <w:r>
+        <w:rPr>
+          <w:b w:val="0"/>
+        </w:rPr>
+        <w:t>, 20 seconds later so the network is up); a SalesTeam page</w:t>
+      </w:r>
+    </w:p>
+    <w:p>
+      <w:r>
+        <w:rPr>
+          <w:b w:val="0"/>
+        </w:rPr>
+        <w:t xml:space="preserve">  opens and every 10 minutes while one is open; a user's batch job ends (seen as the batch record being</w:t>
+      </w:r>
+    </w:p>
+    <w:p>
+      <w:r>
+        <w:rPr>
+          <w:b w:val="0"/>
+        </w:rPr>
+        <w:t xml:space="preserve">  removed, wherever the job ran); Setup is saved (the wizard re-scores derived priorities, then kicks).</w:t>
+      </w:r>
+    </w:p>
+    <w:p>
+      <w:r>
+        <w:rPr>
+          <w:b w:val="0"/>
+        </w:rPr>
+        <w:t xml:space="preserve">  Imports and Discovery are covered by the page kicks and the batch-end kick.</w:t>
+      </w:r>
+    </w:p>
+    <w:p>
+      <w:pPr>
+        <w:pStyle w:val="ListBullet"/>
+      </w:pPr>
+      <w:r>
+        <w:rPr>
+          <w:b/>
+        </w:rPr>
+        <w:t>Automatic runs</w:t>
+      </w:r>
+      <w:r>
+        <w:rPr>
+          <w:b w:val="0"/>
+        </w:rPr>
+        <w:t xml:space="preserve"> have no account limit: they end at the ceiling, when nothing is left for today, or</w:t>
+      </w:r>
+    </w:p>
+    <w:p>
+      <w:r>
+        <w:rPr>
+          <w:b w:val="0"/>
+        </w:rPr>
+        <w:t xml:space="preserve">  when they make way. They do not keep the computer awake. A run that handled nothing is not logged.</w:t>
+      </w:r>
+    </w:p>
+    <w:p>
+      <w:pPr>
+        <w:pStyle w:val="ListBullet"/>
+      </w:pPr>
+      <w:r>
+        <w:rPr>
+          <w:b/>
+        </w:rPr>
+        <w:t>Making way (U2):</w:t>
+      </w:r>
+      <w:r>
+        <w:rPr>
+          <w:b w:val="0"/>
+        </w:rPr>
+        <w:t xml:space="preserve"> </w:t>
+      </w:r>
+      <w:r>
+        <w:rPr>
+          <w:rFonts w:ascii="Consolas" w:hAnsi="Consolas"/>
+          <w:b w:val="0"/>
+        </w:rPr>
+        <w:t>guardBatchStart</w:t>
+      </w:r>
+      <w:r>
+        <w:rPr>
+          <w:b w:val="0"/>
+        </w:rPr>
+        <w:t xml:space="preserve"> asks the pipeline to pause and waits, up to 2.5 minutes, while</w:t>
+      </w:r>
+    </w:p>
+    <w:p>
+      <w:r>
+        <w:rPr>
+          <w:b w:val="0"/>
+        </w:rPr>
+        <w:t xml:space="preserve">  it finishes the account in progress. It also sets a 3-minute hold on every user start, so no kick can</w:t>
+      </w:r>
+    </w:p>
+    <w:p>
+      <w:r>
+        <w:rPr>
+          <w:b w:val="0"/>
+        </w:rPr>
+        <w:t xml:space="preserve">  slip in between the check and the job taking the batch lock. The end of the job clears the hold and</w:t>
+      </w:r>
+    </w:p>
+    <w:p>
+      <w:r>
+        <w:rPr>
+          <w:b w:val="0"/>
+        </w:rPr>
+        <w:t xml:space="preserve">  kicks. The pipeline's own batches are marked </w:t>
+      </w:r>
+      <w:r>
+        <w:rPr>
+          <w:rFonts w:ascii="Consolas" w:hAnsi="Consolas"/>
+          <w:b w:val="0"/>
+        </w:rPr>
+        <w:t>pipeline: true</w:t>
+      </w:r>
+      <w:r>
+        <w:rPr>
+          <w:b w:val="0"/>
+        </w:rPr>
+        <w:t>, so they never count as a blocker.</w:t>
+      </w:r>
+    </w:p>
+    <w:p>
+      <w:pPr>
+        <w:pStyle w:val="ListBullet"/>
+      </w:pPr>
+      <w:r>
+        <w:rPr>
+          <w:b/>
+        </w:rPr>
+        <w:t>Pause</w:t>
+      </w:r>
+      <w:r>
+        <w:rPr>
+          <w:b w:val="0"/>
+        </w:rPr>
+        <w:t xml:space="preserve"> on the pill stops the run and keeps automation off for the rest of the local day. **Resume</w:t>
+      </w:r>
+    </w:p>
+    <w:p>
+      <w:r>
+        <w:rPr>
+          <w:b w:val="0"/>
+        </w:rPr>
+        <w:t xml:space="preserve">  today** in Settings &gt; Automation undoes it.</w:t>
+      </w:r>
+    </w:p>
+    <w:p>
+      <w:pPr>
+        <w:pStyle w:val="ListBullet"/>
+      </w:pPr>
+      <w:r>
+        <w:rPr>
+          <w:b/>
+        </w:rPr>
+        <w:t>Status line</w:t>
+      </w:r>
+      <w:r>
+        <w:rPr>
+          <w:b w:val="0"/>
+        </w:rPr>
+        <w:t xml:space="preserve"> (</w:t>
+      </w:r>
+      <w:r>
+        <w:rPr>
+          <w:rFonts w:ascii="Consolas" w:hAnsi="Consolas"/>
+          <w:b w:val="0"/>
+        </w:rPr>
+        <w:t>pipelineStatusLine</w:t>
+      </w:r>
+      <w:r>
+        <w:rPr>
+          <w:b w:val="0"/>
+        </w:rPr>
+        <w:t>), under the pie and in Settings: working on an account; off;</w:t>
+      </w:r>
+    </w:p>
+    <w:p>
+      <w:r>
+        <w:rPr>
+          <w:b w:val="0"/>
+        </w:rPr>
+        <w:t xml:space="preserve">  paused for today; paused while you scan or run another job; limit reached, with the time it frees</w:t>
+      </w:r>
+    </w:p>
+    <w:p>
+      <w:r>
+        <w:rPr>
+          <w:b w:val="0"/>
+        </w:rPr>
+        <w:t xml:space="preserve">  up (</w:t>
+      </w:r>
+      <w:r>
+        <w:rPr>
+          <w:rFonts w:ascii="Consolas" w:hAnsi="Consolas"/>
+          <w:b w:val="0"/>
+        </w:rPr>
+        <w:t>timeBelowCeiling</w:t>
+      </w:r>
+      <w:r>
+        <w:rPr>
+          <w:b w:val="0"/>
+        </w:rPr>
+        <w:t>); all accounts processed; waiting for today's backup.</w:t>
+      </w:r>
+    </w:p>
+    <w:p>
+      <w:pPr>
+        <w:pStyle w:val="ListBullet"/>
+      </w:pPr>
+      <w:r>
+        <w:rPr>
+          <w:b/>
+        </w:rPr>
+        <w:t>Ceiling lowered from 75 to 60</w:t>
+      </w:r>
+      <w:r>
+        <w:rPr>
+          <w:b w:val="0"/>
+        </w:rPr>
+        <w:t xml:space="preserve"> (2026-09-25, Boaz), after one scan used 70 of the 99 on the first day</w:t>
+      </w:r>
+    </w:p>
+    <w:p>
+      <w:r>
+        <w:rPr>
+          <w:b w:val="0"/>
+        </w:rPr>
+        <w:t xml:space="preserve">  of automatic runs. The pipeline now leaves 39 visits a day to the user's own scans. The 75 elsewhere in</w:t>
+      </w:r>
+    </w:p>
+    <w:p>
+      <w:r>
+        <w:rPr>
+          <w:b w:val="0"/>
+        </w:rPr>
+        <w:t xml:space="preserve">  this document is the original design figure.</w:t>
+      </w:r>
+    </w:p>
+    <w:p>
+      <w:pPr>
+        <w:pStyle w:val="ListBullet"/>
+      </w:pPr>
+      <w:r>
+        <w:rPr>
+          <w:b/>
+        </w:rPr>
+        <w:t>Scanner:</w:t>
+      </w:r>
+      <w:r>
+        <w:rPr>
+          <w:b w:val="0"/>
+        </w:rPr>
+        <w:t xml:space="preserve"> 0 Ready accounts: the scan does not start, and the message says why. 1 to 4: </w:t>
+      </w:r>
+      <w:r>
+        <w:rPr>
+          <w:b/>
+        </w:rPr>
+        <w:t>Scan anyway</w:t>
+      </w:r>
+      <w:r>
+        <w:rPr>
+          <w:b w:val="0"/>
+        </w:rPr>
+        <w:t xml:space="preserve"> /</w:t>
+      </w:r>
+    </w:p>
+    <w:p>
+      <w:r>
+        <w:rPr>
+          <w:b w:val="0"/>
+        </w:rPr>
+        <w:t xml:space="preserve">  </w:t>
+      </w:r>
+      <w:r>
+        <w:rPr>
+          <w:b/>
+        </w:rPr>
+        <w:t>Cancel</w:t>
+      </w:r>
+      <w:r>
+        <w:rPr>
+          <w:b w:val="0"/>
+        </w:rPr>
+        <w:t>. Both messages point to Settings &gt; Automation when it is off.</w:t>
+      </w:r>
+    </w:p>
+    <w:p>
+      <w:pPr>
+        <w:pStyle w:val="ListBullet"/>
+      </w:pPr>
+      <w:r>
+        <w:rPr>
+          <w:b/>
+        </w:rPr>
+        <w:t>Not built in step 3:</w:t>
+      </w:r>
+      <w:r>
+        <w:rPr>
+          <w:b w:val="0"/>
+        </w:rPr>
+        <w:t xml:space="preserve"> the wizard's readiness checklist before the consent (10.1: region, sizes,</w:t>
+      </w:r>
+    </w:p>
+    <w:p>
+      <w:r>
+        <w:rPr>
+          <w:b w:val="0"/>
+        </w:rPr>
+        <w:t xml:space="preserve">  seniority levels, LinkedIn signed in). The consent is a plain tick box on the last step. The</w:t>
+      </w:r>
+    </w:p>
+    <w:p>
+      <w:r>
+        <w:rPr>
+          <w:b w:val="0"/>
+        </w:rPr>
+        <w:t xml:space="preserve">  "about 25 more by the end of the day" estimate (10.2 and 10.4) is left out: there is no measured</w:t>
+      </w:r>
+    </w:p>
+    <w:p>
+      <w:r>
+        <w:rPr>
+          <w:b w:val="0"/>
+        </w:rPr>
+        <w:t xml:space="preserve">  rate yet to base it on.</w:t>
       </w:r>
     </w:p>
     <w:p>

</xml_diff>